<commit_message>
knoweldge 6/25/2026 part 3
</commit_message>
<xml_diff>
--- a/Knowledge/3-Work knowledge/1-Software Engineering/1-Fundamentals/5-My Source/7-Software/5-Software Development Life Cycle (SDLC)/1-Phases of SDLC/1-Coding Concepts/1-Code.docx
+++ b/Knowledge/3-Work knowledge/1-Software Engineering/1-Fundamentals/5-My Source/7-Software/5-Software Development Life Cycle (SDLC)/1-Phases of SDLC/1-Coding Concepts/1-Code.docx
@@ -42,7 +42,27 @@
           <w:sz w:val="18"/>
           <w:highlight w:val="lightGray"/>
         </w:rPr>
-        <w:t xml:space="preserve">: Persons Table -&gt; ID Column: 1, Name_En Column: Motasem Essam] -&gt; </w:t>
+        <w:t xml:space="preserve">: Persons Table -&gt; ID Column: 1, </w:t>
+      </w:r>
+      <w:proofErr w:type="spellStart"/>
+      <w:r>
+        <w:rPr>
+          <w:rFonts w:ascii="Arial" w:hAnsi="Arial"/>
+          <w:color w:val="000000"/>
+          <w:sz w:val="18"/>
+          <w:highlight w:val="lightGray"/>
+        </w:rPr>
+        <w:t>Name_En</w:t>
+      </w:r>
+      <w:proofErr w:type="spellEnd"/>
+      <w:r>
+        <w:rPr>
+          <w:rFonts w:ascii="Arial" w:hAnsi="Arial"/>
+          <w:color w:val="000000"/>
+          <w:sz w:val="18"/>
+          <w:highlight w:val="lightGray"/>
+        </w:rPr>
+        <w:t xml:space="preserve"> Column: Motasem Essam] -&gt; </w:t>
       </w:r>
       <w:r>
         <w:rPr>
@@ -98,16 +118,34 @@
           <w:sz w:val="18"/>
           <w:highlight w:val="lightGray"/>
         </w:rPr>
-        <w:t xml:space="preserve"> [6/</w:t>
-      </w:r>
-      <w:r>
-        <w:rPr>
-          <w:rFonts w:ascii="Arial" w:hAnsi="Arial"/>
-          <w:color w:val="000000"/>
-          <w:sz w:val="18"/>
-          <w:highlight w:val="lightGray"/>
-        </w:rPr>
-        <w:t>7</w:t>
+        <w:t xml:space="preserve"> [</w:t>
+      </w:r>
+      <w:r>
+        <w:rPr>
+          <w:rFonts w:ascii="Arial" w:hAnsi="Arial"/>
+          <w:color w:val="000000"/>
+          <w:sz w:val="18"/>
+          <w:highlight w:val="lightGray"/>
+        </w:rPr>
+        <w:t>1</w:t>
+      </w:r>
+      <w:r>
+        <w:rPr>
+          <w:rFonts w:ascii="Arial" w:hAnsi="Arial"/>
+          <w:color w:val="000000"/>
+          <w:sz w:val="18"/>
+          <w:highlight w:val="lightGray"/>
+        </w:rPr>
+        <w:t>/</w:t>
+      </w:r>
+      <w:r>
+        <w:rPr>
+          <w:rFonts w:ascii="Arial" w:hAnsi="Arial"/>
+          <w:color w:val="000000"/>
+          <w:sz w:val="18"/>
+          <w:highlight w:val="lightGray"/>
+        </w:rPr>
+        <w:t>23</w:t>
       </w:r>
       <w:r>
         <w:rPr>
@@ -164,7 +202,7 @@
           <w:rFonts w:ascii="Roboto Mono" w:hAnsi="Roboto Mono"/>
         </w:rPr>
         <w:pict w14:anchorId="3F3A3FB9">
-          <v:rect id="_x0000_i1223" style="width:0;height:1.5pt" o:hralign="center" o:hrstd="t" o:hr="t" fillcolor="#a0a0a0" stroked="f"/>
+          <v:rect id="_x0000_i1025" style="width:0;height:1.5pt" o:hralign="center" o:hrstd="t" o:hr="t" fillcolor="#a0a0a0" stroked="f"/>
         </w:pict>
       </w:r>
     </w:p>
@@ -207,7 +245,27 @@
           <w:sz w:val="18"/>
           <w:highlight w:val="lightGray"/>
         </w:rPr>
-        <w:t xml:space="preserve">: Persons Table -&gt; ID Column: 1, Name_En Column: Motasem Essam] -&gt; </w:t>
+        <w:t xml:space="preserve">: Persons Table -&gt; ID Column: 1, </w:t>
+      </w:r>
+      <w:proofErr w:type="spellStart"/>
+      <w:r>
+        <w:rPr>
+          <w:rFonts w:ascii="Arial" w:hAnsi="Arial"/>
+          <w:color w:val="000000"/>
+          <w:sz w:val="18"/>
+          <w:highlight w:val="lightGray"/>
+        </w:rPr>
+        <w:t>Name_En</w:t>
+      </w:r>
+      <w:proofErr w:type="spellEnd"/>
+      <w:r>
+        <w:rPr>
+          <w:rFonts w:ascii="Arial" w:hAnsi="Arial"/>
+          <w:color w:val="000000"/>
+          <w:sz w:val="18"/>
+          <w:highlight w:val="lightGray"/>
+        </w:rPr>
+        <w:t xml:space="preserve"> Column: Motasem Essam] -&gt; </w:t>
       </w:r>
       <w:r>
         <w:rPr>
@@ -263,16 +321,34 @@
           <w:sz w:val="18"/>
           <w:highlight w:val="lightGray"/>
         </w:rPr>
-        <w:t xml:space="preserve"> [6/</w:t>
-      </w:r>
-      <w:r>
-        <w:rPr>
-          <w:rFonts w:ascii="Arial" w:hAnsi="Arial"/>
-          <w:color w:val="000000"/>
-          <w:sz w:val="18"/>
-          <w:highlight w:val="lightGray"/>
-        </w:rPr>
-        <w:t>7</w:t>
+        <w:t xml:space="preserve"> [</w:t>
+      </w:r>
+      <w:r>
+        <w:rPr>
+          <w:rFonts w:ascii="Arial" w:hAnsi="Arial"/>
+          <w:color w:val="000000"/>
+          <w:sz w:val="18"/>
+          <w:highlight w:val="lightGray"/>
+        </w:rPr>
+        <w:t>1</w:t>
+      </w:r>
+      <w:r>
+        <w:rPr>
+          <w:rFonts w:ascii="Arial" w:hAnsi="Arial"/>
+          <w:color w:val="000000"/>
+          <w:sz w:val="18"/>
+          <w:highlight w:val="lightGray"/>
+        </w:rPr>
+        <w:t>/</w:t>
+      </w:r>
+      <w:r>
+        <w:rPr>
+          <w:rFonts w:ascii="Arial" w:hAnsi="Arial"/>
+          <w:color w:val="000000"/>
+          <w:sz w:val="18"/>
+          <w:highlight w:val="lightGray"/>
+        </w:rPr>
+        <w:t>23</w:t>
       </w:r>
       <w:r>
         <w:rPr>
@@ -376,7 +452,7 @@
           <w:rFonts w:ascii="Roboto Mono" w:hAnsi="Roboto Mono"/>
         </w:rPr>
         <w:pict w14:anchorId="38AB6A0F">
-          <v:rect id="_x0000_i1224" style="width:0;height:1.5pt" o:hralign="center" o:hrstd="t" o:hr="t" fillcolor="#a0a0a0" stroked="f"/>
+          <v:rect id="_x0000_i1026" style="width:0;height:1.5pt" o:hralign="center" o:hrstd="t" o:hr="t" fillcolor="#a0a0a0" stroked="f"/>
         </w:pict>
       </w:r>
     </w:p>
@@ -412,7 +488,27 @@
           <w:sz w:val="18"/>
           <w:highlight w:val="lightGray"/>
         </w:rPr>
-        <w:t xml:space="preserve">: Persons Table -&gt; ID Column: 1, Name_En Column: Motasem Essam] -&gt; </w:t>
+        <w:t xml:space="preserve">: Persons Table -&gt; ID Column: 1, </w:t>
+      </w:r>
+      <w:proofErr w:type="spellStart"/>
+      <w:r>
+        <w:rPr>
+          <w:rFonts w:ascii="Arial" w:hAnsi="Arial"/>
+          <w:color w:val="000000"/>
+          <w:sz w:val="18"/>
+          <w:highlight w:val="lightGray"/>
+        </w:rPr>
+        <w:t>Name_En</w:t>
+      </w:r>
+      <w:proofErr w:type="spellEnd"/>
+      <w:r>
+        <w:rPr>
+          <w:rFonts w:ascii="Arial" w:hAnsi="Arial"/>
+          <w:color w:val="000000"/>
+          <w:sz w:val="18"/>
+          <w:highlight w:val="lightGray"/>
+        </w:rPr>
+        <w:t xml:space="preserve"> Column: Motasem Essam] -&gt; </w:t>
       </w:r>
       <w:r>
         <w:rPr>
@@ -468,16 +564,34 @@
           <w:sz w:val="18"/>
           <w:highlight w:val="lightGray"/>
         </w:rPr>
-        <w:t xml:space="preserve"> [6/</w:t>
-      </w:r>
-      <w:r>
-        <w:rPr>
-          <w:rFonts w:ascii="Arial" w:hAnsi="Arial"/>
-          <w:color w:val="000000"/>
-          <w:sz w:val="18"/>
-          <w:highlight w:val="lightGray"/>
-        </w:rPr>
-        <w:t>7</w:t>
+        <w:t xml:space="preserve"> [</w:t>
+      </w:r>
+      <w:r>
+        <w:rPr>
+          <w:rFonts w:ascii="Arial" w:hAnsi="Arial"/>
+          <w:color w:val="000000"/>
+          <w:sz w:val="18"/>
+          <w:highlight w:val="lightGray"/>
+        </w:rPr>
+        <w:t>1</w:t>
+      </w:r>
+      <w:r>
+        <w:rPr>
+          <w:rFonts w:ascii="Arial" w:hAnsi="Arial"/>
+          <w:color w:val="000000"/>
+          <w:sz w:val="18"/>
+          <w:highlight w:val="lightGray"/>
+        </w:rPr>
+        <w:t>/</w:t>
+      </w:r>
+      <w:r>
+        <w:rPr>
+          <w:rFonts w:ascii="Arial" w:hAnsi="Arial"/>
+          <w:color w:val="000000"/>
+          <w:sz w:val="18"/>
+          <w:highlight w:val="lightGray"/>
+        </w:rPr>
+        <w:t>23</w:t>
       </w:r>
       <w:r>
         <w:rPr>
@@ -645,7 +759,7 @@
           <w:rFonts w:ascii="Roboto Mono" w:hAnsi="Roboto Mono"/>
         </w:rPr>
         <w:pict w14:anchorId="231090BA">
-          <v:rect id="_x0000_i1225" style="width:0;height:1.5pt" o:hralign="center" o:hrstd="t" o:hr="t" fillcolor="#a0a0a0" stroked="f"/>
+          <v:rect id="_x0000_i1027" style="width:0;height:1.5pt" o:hralign="center" o:hrstd="t" o:hr="t" fillcolor="#a0a0a0" stroked="f"/>
         </w:pict>
       </w:r>
     </w:p>
@@ -779,7 +893,7 @@
           <w:rFonts w:ascii="Roboto Mono" w:hAnsi="Roboto Mono"/>
         </w:rPr>
         <w:pict w14:anchorId="4D8CE9CA">
-          <v:rect id="_x0000_i1226" style="width:0;height:1.5pt" o:hralign="center" o:hrstd="t" o:hr="t" fillcolor="#a0a0a0" stroked="f"/>
+          <v:rect id="_x0000_i1028" style="width:0;height:1.5pt" o:hralign="center" o:hrstd="t" o:hr="t" fillcolor="#a0a0a0" stroked="f"/>
         </w:pict>
       </w:r>
     </w:p>
@@ -822,7 +936,27 @@
           <w:sz w:val="18"/>
           <w:highlight w:val="lightGray"/>
         </w:rPr>
-        <w:t xml:space="preserve">: Persons Table -&gt; ID Column: 1, Name_En Column: Motasem Essam] -&gt; </w:t>
+        <w:t xml:space="preserve">: Persons Table -&gt; ID Column: 1, </w:t>
+      </w:r>
+      <w:proofErr w:type="spellStart"/>
+      <w:r>
+        <w:rPr>
+          <w:rFonts w:ascii="Arial" w:hAnsi="Arial"/>
+          <w:color w:val="000000"/>
+          <w:sz w:val="18"/>
+          <w:highlight w:val="lightGray"/>
+        </w:rPr>
+        <w:t>Name_En</w:t>
+      </w:r>
+      <w:proofErr w:type="spellEnd"/>
+      <w:r>
+        <w:rPr>
+          <w:rFonts w:ascii="Arial" w:hAnsi="Arial"/>
+          <w:color w:val="000000"/>
+          <w:sz w:val="18"/>
+          <w:highlight w:val="lightGray"/>
+        </w:rPr>
+        <w:t xml:space="preserve"> Column: Motasem Essam] -&gt; </w:t>
       </w:r>
       <w:r>
         <w:rPr>
@@ -878,16 +1012,34 @@
           <w:sz w:val="18"/>
           <w:highlight w:val="lightGray"/>
         </w:rPr>
-        <w:t xml:space="preserve"> [6/</w:t>
-      </w:r>
-      <w:r>
-        <w:rPr>
-          <w:rFonts w:ascii="Arial" w:hAnsi="Arial"/>
-          <w:color w:val="000000"/>
-          <w:sz w:val="18"/>
-          <w:highlight w:val="lightGray"/>
-        </w:rPr>
-        <w:t>7</w:t>
+        <w:t xml:space="preserve"> [</w:t>
+      </w:r>
+      <w:r>
+        <w:rPr>
+          <w:rFonts w:ascii="Arial" w:hAnsi="Arial"/>
+          <w:color w:val="000000"/>
+          <w:sz w:val="18"/>
+          <w:highlight w:val="lightGray"/>
+        </w:rPr>
+        <w:t>1</w:t>
+      </w:r>
+      <w:r>
+        <w:rPr>
+          <w:rFonts w:ascii="Arial" w:hAnsi="Arial"/>
+          <w:color w:val="000000"/>
+          <w:sz w:val="18"/>
+          <w:highlight w:val="lightGray"/>
+        </w:rPr>
+        <w:t>/</w:t>
+      </w:r>
+      <w:r>
+        <w:rPr>
+          <w:rFonts w:ascii="Arial" w:hAnsi="Arial"/>
+          <w:color w:val="000000"/>
+          <w:sz w:val="18"/>
+          <w:highlight w:val="lightGray"/>
+        </w:rPr>
+        <w:t>23</w:t>
       </w:r>
       <w:r>
         <w:rPr>
@@ -1084,7 +1236,7 @@
           <w:rFonts w:ascii="Roboto Mono" w:hAnsi="Roboto Mono"/>
         </w:rPr>
         <w:pict w14:anchorId="31F1C965">
-          <v:rect id="_x0000_i1227" style="width:0;height:1.5pt" o:hralign="center" o:hrstd="t" o:hr="t" fillcolor="#a0a0a0" stroked="f"/>
+          <v:rect id="_x0000_i1029" style="width:0;height:1.5pt" o:hralign="center" o:hrstd="t" o:hr="t" fillcolor="#a0a0a0" stroked="f"/>
         </w:pict>
       </w:r>
     </w:p>
@@ -1120,7 +1272,27 @@
           <w:sz w:val="18"/>
           <w:highlight w:val="lightGray"/>
         </w:rPr>
-        <w:t xml:space="preserve">: Persons Table -&gt; ID Column: 1, Name_En Column: Motasem Essam] -&gt; </w:t>
+        <w:t xml:space="preserve">: Persons Table -&gt; ID Column: 1, </w:t>
+      </w:r>
+      <w:proofErr w:type="spellStart"/>
+      <w:r>
+        <w:rPr>
+          <w:rFonts w:ascii="Arial" w:hAnsi="Arial"/>
+          <w:color w:val="000000"/>
+          <w:sz w:val="18"/>
+          <w:highlight w:val="lightGray"/>
+        </w:rPr>
+        <w:t>Name_En</w:t>
+      </w:r>
+      <w:proofErr w:type="spellEnd"/>
+      <w:r>
+        <w:rPr>
+          <w:rFonts w:ascii="Arial" w:hAnsi="Arial"/>
+          <w:color w:val="000000"/>
+          <w:sz w:val="18"/>
+          <w:highlight w:val="lightGray"/>
+        </w:rPr>
+        <w:t xml:space="preserve"> Column: Motasem Essam] -&gt; </w:t>
       </w:r>
       <w:r>
         <w:rPr>
@@ -1176,16 +1348,34 @@
           <w:sz w:val="18"/>
           <w:highlight w:val="lightGray"/>
         </w:rPr>
-        <w:t xml:space="preserve"> [6/</w:t>
-      </w:r>
-      <w:r>
-        <w:rPr>
-          <w:rFonts w:ascii="Arial" w:hAnsi="Arial"/>
-          <w:color w:val="000000"/>
-          <w:sz w:val="18"/>
-          <w:highlight w:val="lightGray"/>
-        </w:rPr>
-        <w:t>7</w:t>
+        <w:t xml:space="preserve"> [</w:t>
+      </w:r>
+      <w:r>
+        <w:rPr>
+          <w:rFonts w:ascii="Arial" w:hAnsi="Arial"/>
+          <w:color w:val="000000"/>
+          <w:sz w:val="18"/>
+          <w:highlight w:val="lightGray"/>
+        </w:rPr>
+        <w:t>1</w:t>
+      </w:r>
+      <w:r>
+        <w:rPr>
+          <w:rFonts w:ascii="Arial" w:hAnsi="Arial"/>
+          <w:color w:val="000000"/>
+          <w:sz w:val="18"/>
+          <w:highlight w:val="lightGray"/>
+        </w:rPr>
+        <w:t>/</w:t>
+      </w:r>
+      <w:r>
+        <w:rPr>
+          <w:rFonts w:ascii="Arial" w:hAnsi="Arial"/>
+          <w:color w:val="000000"/>
+          <w:sz w:val="18"/>
+          <w:highlight w:val="lightGray"/>
+        </w:rPr>
+        <w:t>23</w:t>
       </w:r>
       <w:r>
         <w:rPr>
@@ -1286,8 +1476,16 @@
         <w:rPr>
           <w:rFonts w:ascii="Roboto Mono" w:hAnsi="Roboto Mono"/>
         </w:rPr>
-        <w:t>&lt;?php</w:t>
-      </w:r>
+        <w:t>&lt;?</w:t>
+      </w:r>
+      <w:proofErr w:type="spellStart"/>
+      <w:r>
+        <w:rPr>
+          <w:rFonts w:ascii="Roboto Mono" w:hAnsi="Roboto Mono"/>
+        </w:rPr>
+        <w:t>php</w:t>
+      </w:r>
+      <w:proofErr w:type="spellEnd"/>
       <w:r>
         <w:rPr>
           <w:rFonts w:ascii="Roboto Mono" w:hAnsi="Roboto Mono"/>
@@ -1412,7 +1610,7 @@
           <w:rFonts w:ascii="Roboto Mono" w:hAnsi="Roboto Mono"/>
         </w:rPr>
         <w:pict w14:anchorId="23C7E775">
-          <v:rect id="_x0000_i1228" style="width:0;height:1.5pt" o:hralign="center" o:hrstd="t" o:hr="t" fillcolor="#a0a0a0" stroked="f"/>
+          <v:rect id="_x0000_i1030" style="width:0;height:1.5pt" o:hralign="center" o:hrstd="t" o:hr="t" fillcolor="#a0a0a0" stroked="f"/>
         </w:pict>
       </w:r>
     </w:p>
@@ -1606,7 +1804,7 @@
           <w:rFonts w:ascii="Roboto Mono" w:hAnsi="Roboto Mono"/>
         </w:rPr>
         <w:pict w14:anchorId="47073D15">
-          <v:rect id="_x0000_i1229" style="width:0;height:1.5pt" o:hralign="center" o:hrstd="t" o:hr="t" fillcolor="#a0a0a0" stroked="f"/>
+          <v:rect id="_x0000_i1031" style="width:0;height:1.5pt" o:hralign="center" o:hrstd="t" o:hr="t" fillcolor="#a0a0a0" stroked="f"/>
         </w:pict>
       </w:r>
     </w:p>
@@ -1799,7 +1997,7 @@
           <w:rFonts w:ascii="Roboto Mono" w:hAnsi="Roboto Mono"/>
         </w:rPr>
         <w:pict w14:anchorId="7BBF36B3">
-          <v:rect id="_x0000_i1230" style="width:0;height:1.5pt" o:hralign="center" o:hrstd="t" o:hr="t" fillcolor="#a0a0a0" stroked="f"/>
+          <v:rect id="_x0000_i1032" style="width:0;height:1.5pt" o:hralign="center" o:hrstd="t" o:hr="t" fillcolor="#a0a0a0" stroked="f"/>
         </w:pict>
       </w:r>
     </w:p>
@@ -1852,7 +2050,27 @@
           <w:sz w:val="18"/>
           <w:highlight w:val="lightGray"/>
         </w:rPr>
-        <w:t xml:space="preserve">: Persons Table -&gt; ID Column: 1, Name_En Column: Motasem Essam] -&gt; </w:t>
+        <w:t xml:space="preserve">: Persons Table -&gt; ID Column: 1, </w:t>
+      </w:r>
+      <w:proofErr w:type="spellStart"/>
+      <w:r>
+        <w:rPr>
+          <w:rFonts w:ascii="Arial" w:hAnsi="Arial"/>
+          <w:color w:val="000000"/>
+          <w:sz w:val="18"/>
+          <w:highlight w:val="lightGray"/>
+        </w:rPr>
+        <w:t>Name_En</w:t>
+      </w:r>
+      <w:proofErr w:type="spellEnd"/>
+      <w:r>
+        <w:rPr>
+          <w:rFonts w:ascii="Arial" w:hAnsi="Arial"/>
+          <w:color w:val="000000"/>
+          <w:sz w:val="18"/>
+          <w:highlight w:val="lightGray"/>
+        </w:rPr>
+        <w:t xml:space="preserve"> Column: Motasem Essam] -&gt; </w:t>
       </w:r>
       <w:r>
         <w:rPr>
@@ -1908,16 +2126,34 @@
           <w:sz w:val="18"/>
           <w:highlight w:val="lightGray"/>
         </w:rPr>
-        <w:t xml:space="preserve"> [6/</w:t>
-      </w:r>
-      <w:r>
-        <w:rPr>
-          <w:rFonts w:ascii="Arial" w:hAnsi="Arial"/>
-          <w:color w:val="000000"/>
-          <w:sz w:val="18"/>
-          <w:highlight w:val="lightGray"/>
-        </w:rPr>
-        <w:t>7</w:t>
+        <w:t xml:space="preserve"> [</w:t>
+      </w:r>
+      <w:r>
+        <w:rPr>
+          <w:rFonts w:ascii="Arial" w:hAnsi="Arial"/>
+          <w:color w:val="000000"/>
+          <w:sz w:val="18"/>
+          <w:highlight w:val="lightGray"/>
+        </w:rPr>
+        <w:t>1</w:t>
+      </w:r>
+      <w:r>
+        <w:rPr>
+          <w:rFonts w:ascii="Arial" w:hAnsi="Arial"/>
+          <w:color w:val="000000"/>
+          <w:sz w:val="18"/>
+          <w:highlight w:val="lightGray"/>
+        </w:rPr>
+        <w:t>/</w:t>
+      </w:r>
+      <w:r>
+        <w:rPr>
+          <w:rFonts w:ascii="Arial" w:hAnsi="Arial"/>
+          <w:color w:val="000000"/>
+          <w:sz w:val="18"/>
+          <w:highlight w:val="lightGray"/>
+        </w:rPr>
+        <w:t>23</w:t>
       </w:r>
       <w:r>
         <w:rPr>
@@ -2039,7 +2275,7 @@
           <w:rFonts w:ascii="Roboto Mono" w:hAnsi="Roboto Mono"/>
         </w:rPr>
         <w:pict w14:anchorId="01968253">
-          <v:rect id="_x0000_i1232" style="width:0;height:1.5pt" o:hralign="center" o:hrstd="t" o:hr="t" fillcolor="#a0a0a0" stroked="f"/>
+          <v:rect id="_x0000_i1033" style="width:0;height:1.5pt" o:hralign="center" o:hrstd="t" o:hr="t" fillcolor="#a0a0a0" stroked="f"/>
         </w:pict>
       </w:r>
     </w:p>
@@ -2078,7 +2314,27 @@
           <w:sz w:val="18"/>
           <w:highlight w:val="lightGray"/>
         </w:rPr>
-        <w:t xml:space="preserve">: Persons Table -&gt; ID Column: 1, Name_En Column: Motasem Essam] -&gt; </w:t>
+        <w:t xml:space="preserve">: Persons Table -&gt; ID Column: 1, </w:t>
+      </w:r>
+      <w:proofErr w:type="spellStart"/>
+      <w:r>
+        <w:rPr>
+          <w:rFonts w:ascii="Arial" w:hAnsi="Arial"/>
+          <w:color w:val="000000"/>
+          <w:sz w:val="18"/>
+          <w:highlight w:val="lightGray"/>
+        </w:rPr>
+        <w:t>Name_En</w:t>
+      </w:r>
+      <w:proofErr w:type="spellEnd"/>
+      <w:r>
+        <w:rPr>
+          <w:rFonts w:ascii="Arial" w:hAnsi="Arial"/>
+          <w:color w:val="000000"/>
+          <w:sz w:val="18"/>
+          <w:highlight w:val="lightGray"/>
+        </w:rPr>
+        <w:t xml:space="preserve"> Column: Motasem Essam] -&gt; </w:t>
       </w:r>
       <w:r>
         <w:rPr>
@@ -2134,16 +2390,34 @@
           <w:sz w:val="18"/>
           <w:highlight w:val="lightGray"/>
         </w:rPr>
-        <w:t xml:space="preserve"> [6/</w:t>
-      </w:r>
-      <w:r>
-        <w:rPr>
-          <w:rFonts w:ascii="Arial" w:hAnsi="Arial"/>
-          <w:color w:val="000000"/>
-          <w:sz w:val="18"/>
-          <w:highlight w:val="lightGray"/>
-        </w:rPr>
-        <w:t>7</w:t>
+        <w:t xml:space="preserve"> [</w:t>
+      </w:r>
+      <w:r>
+        <w:rPr>
+          <w:rFonts w:ascii="Arial" w:hAnsi="Arial"/>
+          <w:color w:val="000000"/>
+          <w:sz w:val="18"/>
+          <w:highlight w:val="lightGray"/>
+        </w:rPr>
+        <w:t>1</w:t>
+      </w:r>
+      <w:r>
+        <w:rPr>
+          <w:rFonts w:ascii="Arial" w:hAnsi="Arial"/>
+          <w:color w:val="000000"/>
+          <w:sz w:val="18"/>
+          <w:highlight w:val="lightGray"/>
+        </w:rPr>
+        <w:t>/</w:t>
+      </w:r>
+      <w:r>
+        <w:rPr>
+          <w:rFonts w:ascii="Arial" w:hAnsi="Arial"/>
+          <w:color w:val="000000"/>
+          <w:sz w:val="18"/>
+          <w:highlight w:val="lightGray"/>
+        </w:rPr>
+        <w:t>23</w:t>
       </w:r>
       <w:r>
         <w:rPr>
@@ -2287,7 +2561,7 @@
           <w:rFonts w:ascii="Roboto Mono" w:hAnsi="Roboto Mono"/>
         </w:rPr>
         <w:pict w14:anchorId="06124C8C">
-          <v:rect id="_x0000_i1233" style="width:0;height:1.5pt" o:hralign="center" o:hrstd="t" o:hr="t" fillcolor="#a0a0a0" stroked="f"/>
+          <v:rect id="_x0000_i1034" style="width:0;height:1.5pt" o:hralign="center" o:hrstd="t" o:hr="t" fillcolor="#a0a0a0" stroked="f"/>
         </w:pict>
       </w:r>
     </w:p>
@@ -2326,7 +2600,27 @@
           <w:sz w:val="18"/>
           <w:highlight w:val="lightGray"/>
         </w:rPr>
-        <w:t xml:space="preserve">: Persons Table -&gt; ID Column: 1, Name_En Column: Motasem Essam] -&gt; </w:t>
+        <w:t xml:space="preserve">: Persons Table -&gt; ID Column: 1, </w:t>
+      </w:r>
+      <w:proofErr w:type="spellStart"/>
+      <w:r>
+        <w:rPr>
+          <w:rFonts w:ascii="Arial" w:hAnsi="Arial"/>
+          <w:color w:val="000000"/>
+          <w:sz w:val="18"/>
+          <w:highlight w:val="lightGray"/>
+        </w:rPr>
+        <w:t>Name_En</w:t>
+      </w:r>
+      <w:proofErr w:type="spellEnd"/>
+      <w:r>
+        <w:rPr>
+          <w:rFonts w:ascii="Arial" w:hAnsi="Arial"/>
+          <w:color w:val="000000"/>
+          <w:sz w:val="18"/>
+          <w:highlight w:val="lightGray"/>
+        </w:rPr>
+        <w:t xml:space="preserve"> Column: Motasem Essam] -&gt; </w:t>
       </w:r>
       <w:r>
         <w:rPr>
@@ -2382,16 +2676,34 @@
           <w:sz w:val="18"/>
           <w:highlight w:val="lightGray"/>
         </w:rPr>
-        <w:t xml:space="preserve"> [6/</w:t>
-      </w:r>
-      <w:r>
-        <w:rPr>
-          <w:rFonts w:ascii="Arial" w:hAnsi="Arial"/>
-          <w:color w:val="000000"/>
-          <w:sz w:val="18"/>
-          <w:highlight w:val="lightGray"/>
-        </w:rPr>
-        <w:t>7</w:t>
+        <w:t xml:space="preserve"> [</w:t>
+      </w:r>
+      <w:r>
+        <w:rPr>
+          <w:rFonts w:ascii="Arial" w:hAnsi="Arial"/>
+          <w:color w:val="000000"/>
+          <w:sz w:val="18"/>
+          <w:highlight w:val="lightGray"/>
+        </w:rPr>
+        <w:t>1</w:t>
+      </w:r>
+      <w:r>
+        <w:rPr>
+          <w:rFonts w:ascii="Arial" w:hAnsi="Arial"/>
+          <w:color w:val="000000"/>
+          <w:sz w:val="18"/>
+          <w:highlight w:val="lightGray"/>
+        </w:rPr>
+        <w:t>/</w:t>
+      </w:r>
+      <w:r>
+        <w:rPr>
+          <w:rFonts w:ascii="Arial" w:hAnsi="Arial"/>
+          <w:color w:val="000000"/>
+          <w:sz w:val="18"/>
+          <w:highlight w:val="lightGray"/>
+        </w:rPr>
+        <w:t>23</w:t>
       </w:r>
       <w:r>
         <w:rPr>
@@ -2527,7 +2839,7 @@
           <w:rFonts w:ascii="Roboto Mono" w:hAnsi="Roboto Mono"/>
         </w:rPr>
         <w:pict w14:anchorId="070F58A7">
-          <v:rect id="_x0000_i1234" style="width:0;height:1.5pt" o:hralign="center" o:hrstd="t" o:hr="t" fillcolor="#a0a0a0" stroked="f"/>
+          <v:rect id="_x0000_i1035" style="width:0;height:1.5pt" o:hralign="center" o:hrstd="t" o:hr="t" fillcolor="#a0a0a0" stroked="f"/>
         </w:pict>
       </w:r>
     </w:p>
@@ -2566,7 +2878,27 @@
           <w:sz w:val="18"/>
           <w:highlight w:val="lightGray"/>
         </w:rPr>
-        <w:t xml:space="preserve">: Persons Table -&gt; ID Column: 1, Name_En Column: Motasem Essam] -&gt; </w:t>
+        <w:t xml:space="preserve">: Persons Table -&gt; ID Column: 1, </w:t>
+      </w:r>
+      <w:proofErr w:type="spellStart"/>
+      <w:r>
+        <w:rPr>
+          <w:rFonts w:ascii="Arial" w:hAnsi="Arial"/>
+          <w:color w:val="000000"/>
+          <w:sz w:val="18"/>
+          <w:highlight w:val="lightGray"/>
+        </w:rPr>
+        <w:t>Name_En</w:t>
+      </w:r>
+      <w:proofErr w:type="spellEnd"/>
+      <w:r>
+        <w:rPr>
+          <w:rFonts w:ascii="Arial" w:hAnsi="Arial"/>
+          <w:color w:val="000000"/>
+          <w:sz w:val="18"/>
+          <w:highlight w:val="lightGray"/>
+        </w:rPr>
+        <w:t xml:space="preserve"> Column: Motasem Essam] -&gt; </w:t>
       </w:r>
       <w:r>
         <w:rPr>
@@ -2622,16 +2954,34 @@
           <w:sz w:val="18"/>
           <w:highlight w:val="lightGray"/>
         </w:rPr>
-        <w:t xml:space="preserve"> [6/</w:t>
-      </w:r>
-      <w:r>
-        <w:rPr>
-          <w:rFonts w:ascii="Arial" w:hAnsi="Arial"/>
-          <w:color w:val="000000"/>
-          <w:sz w:val="18"/>
-          <w:highlight w:val="lightGray"/>
-        </w:rPr>
-        <w:t>7</w:t>
+        <w:t xml:space="preserve"> [</w:t>
+      </w:r>
+      <w:r>
+        <w:rPr>
+          <w:rFonts w:ascii="Arial" w:hAnsi="Arial"/>
+          <w:color w:val="000000"/>
+          <w:sz w:val="18"/>
+          <w:highlight w:val="lightGray"/>
+        </w:rPr>
+        <w:t>1</w:t>
+      </w:r>
+      <w:r>
+        <w:rPr>
+          <w:rFonts w:ascii="Arial" w:hAnsi="Arial"/>
+          <w:color w:val="000000"/>
+          <w:sz w:val="18"/>
+          <w:highlight w:val="lightGray"/>
+        </w:rPr>
+        <w:t>/</w:t>
+      </w:r>
+      <w:r>
+        <w:rPr>
+          <w:rFonts w:ascii="Arial" w:hAnsi="Arial"/>
+          <w:color w:val="000000"/>
+          <w:sz w:val="18"/>
+          <w:highlight w:val="lightGray"/>
+        </w:rPr>
+        <w:t>23</w:t>
       </w:r>
       <w:r>
         <w:rPr>
@@ -2740,14 +3090,70 @@
         <w:rPr>
           <w:rFonts w:ascii="Roboto Mono" w:hAnsi="Roboto Mono"/>
         </w:rPr>
-        <w:t>for ($i = 1; $i &lt;= 5; $i++) {</w:t>
+        <w:t>for ($</w:t>
+      </w:r>
+      <w:proofErr w:type="spellStart"/>
+      <w:r>
+        <w:rPr>
+          <w:rFonts w:ascii="Roboto Mono" w:hAnsi="Roboto Mono"/>
+        </w:rPr>
+        <w:t>i</w:t>
+      </w:r>
+      <w:proofErr w:type="spellEnd"/>
+      <w:r>
+        <w:rPr>
+          <w:rFonts w:ascii="Roboto Mono" w:hAnsi="Roboto Mono"/>
+        </w:rPr>
+        <w:t xml:space="preserve"> = 1; $</w:t>
+      </w:r>
+      <w:proofErr w:type="spellStart"/>
+      <w:r>
+        <w:rPr>
+          <w:rFonts w:ascii="Roboto Mono" w:hAnsi="Roboto Mono"/>
+        </w:rPr>
+        <w:t>i</w:t>
+      </w:r>
+      <w:proofErr w:type="spellEnd"/>
+      <w:r>
+        <w:rPr>
+          <w:rFonts w:ascii="Roboto Mono" w:hAnsi="Roboto Mono"/>
+        </w:rPr>
+        <w:t xml:space="preserve"> &lt;= 5; $</w:t>
+      </w:r>
+      <w:proofErr w:type="spellStart"/>
+      <w:r>
+        <w:rPr>
+          <w:rFonts w:ascii="Roboto Mono" w:hAnsi="Roboto Mono"/>
+        </w:rPr>
+        <w:t>i</w:t>
+      </w:r>
+      <w:proofErr w:type="spellEnd"/>
+      <w:r>
+        <w:rPr>
+          <w:rFonts w:ascii="Roboto Mono" w:hAnsi="Roboto Mono"/>
+        </w:rPr>
+        <w:t>++) {</w:t>
       </w:r>
       <w:r>
         <w:rPr>
           <w:rFonts w:ascii="Roboto Mono" w:hAnsi="Roboto Mono"/>
         </w:rPr>
         <w:br/>
-        <w:t xml:space="preserve">    echo $i;</w:t>
+        <w:t xml:space="preserve">    echo $</w:t>
+      </w:r>
+      <w:proofErr w:type="spellStart"/>
+      <w:r>
+        <w:rPr>
+          <w:rFonts w:ascii="Roboto Mono" w:hAnsi="Roboto Mono"/>
+        </w:rPr>
+        <w:t>i</w:t>
+      </w:r>
+      <w:proofErr w:type="spellEnd"/>
+      <w:r>
+        <w:rPr>
+          <w:rFonts w:ascii="Roboto Mono" w:hAnsi="Roboto Mono"/>
+        </w:rPr>
+        <w:t>;</w:t>
       </w:r>
       <w:r>
         <w:rPr>
@@ -2768,7 +3174,7 @@
           <w:rFonts w:ascii="Roboto Mono" w:hAnsi="Roboto Mono"/>
         </w:rPr>
         <w:pict w14:anchorId="72C8A9B5">
-          <v:rect id="_x0000_i1235" style="width:0;height:1.5pt" o:hralign="center" o:hrstd="t" o:hr="t" fillcolor="#a0a0a0" stroked="f"/>
+          <v:rect id="_x0000_i1036" style="width:0;height:1.5pt" o:hralign="center" o:hrstd="t" o:hr="t" fillcolor="#a0a0a0" stroked="f"/>
         </w:pict>
       </w:r>
     </w:p>
@@ -2807,7 +3213,27 @@
           <w:sz w:val="18"/>
           <w:highlight w:val="lightGray"/>
         </w:rPr>
-        <w:t xml:space="preserve">: Persons Table -&gt; ID Column: 1, Name_En Column: Motasem Essam] -&gt; </w:t>
+        <w:t xml:space="preserve">: Persons Table -&gt; ID Column: 1, </w:t>
+      </w:r>
+      <w:proofErr w:type="spellStart"/>
+      <w:r>
+        <w:rPr>
+          <w:rFonts w:ascii="Arial" w:hAnsi="Arial"/>
+          <w:color w:val="000000"/>
+          <w:sz w:val="18"/>
+          <w:highlight w:val="lightGray"/>
+        </w:rPr>
+        <w:t>Name_En</w:t>
+      </w:r>
+      <w:proofErr w:type="spellEnd"/>
+      <w:r>
+        <w:rPr>
+          <w:rFonts w:ascii="Arial" w:hAnsi="Arial"/>
+          <w:color w:val="000000"/>
+          <w:sz w:val="18"/>
+          <w:highlight w:val="lightGray"/>
+        </w:rPr>
+        <w:t xml:space="preserve"> Column: Motasem Essam] -&gt; </w:t>
       </w:r>
       <w:r>
         <w:rPr>
@@ -2863,16 +3289,34 @@
           <w:sz w:val="18"/>
           <w:highlight w:val="lightGray"/>
         </w:rPr>
-        <w:t xml:space="preserve"> [6/</w:t>
-      </w:r>
-      <w:r>
-        <w:rPr>
-          <w:rFonts w:ascii="Arial" w:hAnsi="Arial"/>
-          <w:color w:val="000000"/>
-          <w:sz w:val="18"/>
-          <w:highlight w:val="lightGray"/>
-        </w:rPr>
-        <w:t>7</w:t>
+        <w:t xml:space="preserve"> [</w:t>
+      </w:r>
+      <w:r>
+        <w:rPr>
+          <w:rFonts w:ascii="Arial" w:hAnsi="Arial"/>
+          <w:color w:val="000000"/>
+          <w:sz w:val="18"/>
+          <w:highlight w:val="lightGray"/>
+        </w:rPr>
+        <w:t>1</w:t>
+      </w:r>
+      <w:r>
+        <w:rPr>
+          <w:rFonts w:ascii="Arial" w:hAnsi="Arial"/>
+          <w:color w:val="000000"/>
+          <w:sz w:val="18"/>
+          <w:highlight w:val="lightGray"/>
+        </w:rPr>
+        <w:t>/</w:t>
+      </w:r>
+      <w:r>
+        <w:rPr>
+          <w:rFonts w:ascii="Arial" w:hAnsi="Arial"/>
+          <w:color w:val="000000"/>
+          <w:sz w:val="18"/>
+          <w:highlight w:val="lightGray"/>
+        </w:rPr>
+        <w:t>23</w:t>
       </w:r>
       <w:r>
         <w:rPr>
@@ -3015,7 +3459,7 @@
           <w:rFonts w:ascii="Roboto Mono" w:hAnsi="Roboto Mono"/>
         </w:rPr>
         <w:pict w14:anchorId="172377AE">
-          <v:rect id="_x0000_i1236" style="width:0;height:1.5pt" o:hralign="center" o:hrstd="t" o:hr="t" fillcolor="#a0a0a0" stroked="f"/>
+          <v:rect id="_x0000_i1037" style="width:0;height:1.5pt" o:hralign="center" o:hrstd="t" o:hr="t" fillcolor="#a0a0a0" stroked="f"/>
         </w:pict>
       </w:r>
     </w:p>
@@ -3051,7 +3495,27 @@
           <w:sz w:val="18"/>
           <w:highlight w:val="lightGray"/>
         </w:rPr>
-        <w:t xml:space="preserve">: Persons Table -&gt; ID Column: 1, Name_En Column: Motasem Essam] -&gt; </w:t>
+        <w:t xml:space="preserve">: Persons Table -&gt; ID Column: 1, </w:t>
+      </w:r>
+      <w:proofErr w:type="spellStart"/>
+      <w:r>
+        <w:rPr>
+          <w:rFonts w:ascii="Arial" w:hAnsi="Arial"/>
+          <w:color w:val="000000"/>
+          <w:sz w:val="18"/>
+          <w:highlight w:val="lightGray"/>
+        </w:rPr>
+        <w:t>Name_En</w:t>
+      </w:r>
+      <w:proofErr w:type="spellEnd"/>
+      <w:r>
+        <w:rPr>
+          <w:rFonts w:ascii="Arial" w:hAnsi="Arial"/>
+          <w:color w:val="000000"/>
+          <w:sz w:val="18"/>
+          <w:highlight w:val="lightGray"/>
+        </w:rPr>
+        <w:t xml:space="preserve"> Column: Motasem Essam] -&gt; </w:t>
       </w:r>
       <w:r>
         <w:rPr>
@@ -3107,16 +3571,34 @@
           <w:sz w:val="18"/>
           <w:highlight w:val="lightGray"/>
         </w:rPr>
-        <w:t xml:space="preserve"> [6/</w:t>
-      </w:r>
-      <w:r>
-        <w:rPr>
-          <w:rFonts w:ascii="Arial" w:hAnsi="Arial"/>
-          <w:color w:val="000000"/>
-          <w:sz w:val="18"/>
-          <w:highlight w:val="lightGray"/>
-        </w:rPr>
-        <w:t>7</w:t>
+        <w:t xml:space="preserve"> [</w:t>
+      </w:r>
+      <w:r>
+        <w:rPr>
+          <w:rFonts w:ascii="Arial" w:hAnsi="Arial"/>
+          <w:color w:val="000000"/>
+          <w:sz w:val="18"/>
+          <w:highlight w:val="lightGray"/>
+        </w:rPr>
+        <w:t>1</w:t>
+      </w:r>
+      <w:r>
+        <w:rPr>
+          <w:rFonts w:ascii="Arial" w:hAnsi="Arial"/>
+          <w:color w:val="000000"/>
+          <w:sz w:val="18"/>
+          <w:highlight w:val="lightGray"/>
+        </w:rPr>
+        <w:t>/</w:t>
+      </w:r>
+      <w:r>
+        <w:rPr>
+          <w:rFonts w:ascii="Arial" w:hAnsi="Arial"/>
+          <w:color w:val="000000"/>
+          <w:sz w:val="18"/>
+          <w:highlight w:val="lightGray"/>
+        </w:rPr>
+        <w:t>23</w:t>
       </w:r>
       <w:r>
         <w:rPr>
@@ -3139,7 +3621,7 @@
           <w:rFonts w:ascii="Roboto Mono" w:hAnsi="Roboto Mono"/>
         </w:rPr>
         <w:pict w14:anchorId="46B2FBB1">
-          <v:rect id="_x0000_i1237" style="width:0;height:1.5pt" o:hralign="center" o:hrstd="t" o:hr="t" fillcolor="#a0a0a0" stroked="f"/>
+          <v:rect id="_x0000_i1038" style="width:0;height:1.5pt" o:hralign="center" o:hrstd="t" o:hr="t" fillcolor="#a0a0a0" stroked="f"/>
         </w:pict>
       </w:r>
     </w:p>
@@ -3271,7 +3753,7 @@
           <w:rFonts w:ascii="Roboto Mono" w:hAnsi="Roboto Mono"/>
         </w:rPr>
         <w:pict w14:anchorId="5B6E98F4">
-          <v:rect id="_x0000_i1238" style="width:0;height:1.5pt" o:hralign="center" o:hrstd="t" o:hr="t" fillcolor="#a0a0a0" stroked="f"/>
+          <v:rect id="_x0000_i1039" style="width:0;height:1.5pt" o:hralign="center" o:hrstd="t" o:hr="t" fillcolor="#a0a0a0" stroked="f"/>
         </w:pict>
       </w:r>
     </w:p>
@@ -3402,7 +3884,7 @@
           <w:rFonts w:ascii="Roboto Mono" w:hAnsi="Roboto Mono"/>
         </w:rPr>
         <w:pict w14:anchorId="3CEEB8CF">
-          <v:rect id="_x0000_i1239" style="width:0;height:1.5pt" o:hralign="center" o:hrstd="t" o:hr="t" fillcolor="#a0a0a0" stroked="f"/>
+          <v:rect id="_x0000_i1040" style="width:0;height:1.5pt" o:hralign="center" o:hrstd="t" o:hr="t" fillcolor="#a0a0a0" stroked="f"/>
         </w:pict>
       </w:r>
     </w:p>
@@ -3494,7 +3976,7 @@
           <w:rFonts w:ascii="Roboto Mono" w:hAnsi="Roboto Mono"/>
         </w:rPr>
         <w:pict w14:anchorId="2D34B3D1">
-          <v:rect id="_x0000_i1240" style="width:0;height:1.5pt" o:hralign="center" o:hrstd="t" o:hr="t" fillcolor="#a0a0a0" stroked="f"/>
+          <v:rect id="_x0000_i1041" style="width:0;height:1.5pt" o:hralign="center" o:hrstd="t" o:hr="t" fillcolor="#a0a0a0" stroked="f"/>
         </w:pict>
       </w:r>
     </w:p>
@@ -3530,7 +4012,27 @@
           <w:sz w:val="18"/>
           <w:highlight w:val="lightGray"/>
         </w:rPr>
-        <w:t xml:space="preserve">: Persons Table -&gt; ID Column: 1, Name_En Column: Motasem Essam] -&gt; </w:t>
+        <w:t xml:space="preserve">: Persons Table -&gt; ID Column: 1, </w:t>
+      </w:r>
+      <w:proofErr w:type="spellStart"/>
+      <w:r>
+        <w:rPr>
+          <w:rFonts w:ascii="Arial" w:hAnsi="Arial"/>
+          <w:color w:val="000000"/>
+          <w:sz w:val="18"/>
+          <w:highlight w:val="lightGray"/>
+        </w:rPr>
+        <w:t>Name_En</w:t>
+      </w:r>
+      <w:proofErr w:type="spellEnd"/>
+      <w:r>
+        <w:rPr>
+          <w:rFonts w:ascii="Arial" w:hAnsi="Arial"/>
+          <w:color w:val="000000"/>
+          <w:sz w:val="18"/>
+          <w:highlight w:val="lightGray"/>
+        </w:rPr>
+        <w:t xml:space="preserve"> Column: Motasem Essam] -&gt; </w:t>
       </w:r>
       <w:r>
         <w:rPr>
@@ -3586,16 +4088,34 @@
           <w:sz w:val="18"/>
           <w:highlight w:val="lightGray"/>
         </w:rPr>
-        <w:t xml:space="preserve"> [6/</w:t>
-      </w:r>
-      <w:r>
-        <w:rPr>
-          <w:rFonts w:ascii="Arial" w:hAnsi="Arial"/>
-          <w:color w:val="000000"/>
-          <w:sz w:val="18"/>
-          <w:highlight w:val="lightGray"/>
-        </w:rPr>
-        <w:t>7</w:t>
+        <w:t xml:space="preserve"> [</w:t>
+      </w:r>
+      <w:r>
+        <w:rPr>
+          <w:rFonts w:ascii="Arial" w:hAnsi="Arial"/>
+          <w:color w:val="000000"/>
+          <w:sz w:val="18"/>
+          <w:highlight w:val="lightGray"/>
+        </w:rPr>
+        <w:t>1</w:t>
+      </w:r>
+      <w:r>
+        <w:rPr>
+          <w:rFonts w:ascii="Arial" w:hAnsi="Arial"/>
+          <w:color w:val="000000"/>
+          <w:sz w:val="18"/>
+          <w:highlight w:val="lightGray"/>
+        </w:rPr>
+        <w:t>/</w:t>
+      </w:r>
+      <w:r>
+        <w:rPr>
+          <w:rFonts w:ascii="Arial" w:hAnsi="Arial"/>
+          <w:color w:val="000000"/>
+          <w:sz w:val="18"/>
+          <w:highlight w:val="lightGray"/>
+        </w:rPr>
+        <w:t>23</w:t>
       </w:r>
       <w:r>
         <w:rPr>
@@ -3737,7 +4257,7 @@
           <w:rFonts w:ascii="Roboto Mono" w:hAnsi="Roboto Mono"/>
         </w:rPr>
         <w:pict w14:anchorId="59E331DD">
-          <v:rect id="_x0000_i1241" style="width:0;height:1.5pt" o:hralign="center" o:hrstd="t" o:hr="t" fillcolor="#a0a0a0" stroked="f"/>
+          <v:rect id="_x0000_i1042" style="width:0;height:1.5pt" o:hralign="center" o:hrstd="t" o:hr="t" fillcolor="#a0a0a0" stroked="f"/>
         </w:pict>
       </w:r>
     </w:p>
@@ -3875,7 +4395,7 @@
           <w:rFonts w:ascii="Roboto Mono" w:hAnsi="Roboto Mono"/>
         </w:rPr>
         <w:pict w14:anchorId="7BFCDC6C">
-          <v:rect id="_x0000_i1242" style="width:0;height:1.5pt" o:hralign="center" o:hrstd="t" o:hr="t" fillcolor="#a0a0a0" stroked="f"/>
+          <v:rect id="_x0000_i1043" style="width:0;height:1.5pt" o:hralign="center" o:hrstd="t" o:hr="t" fillcolor="#a0a0a0" stroked="f"/>
         </w:pict>
       </w:r>
     </w:p>
@@ -4003,7 +4523,7 @@
           <w:rFonts w:ascii="Roboto Mono" w:hAnsi="Roboto Mono"/>
         </w:rPr>
         <w:pict w14:anchorId="2EA12614">
-          <v:rect id="_x0000_i1243" style="width:0;height:1.5pt" o:hralign="center" o:hrstd="t" o:hr="t" fillcolor="#a0a0a0" stroked="f"/>
+          <v:rect id="_x0000_i1044" style="width:0;height:1.5pt" o:hralign="center" o:hrstd="t" o:hr="t" fillcolor="#a0a0a0" stroked="f"/>
         </w:pict>
       </w:r>
     </w:p>
@@ -4130,7 +4650,7 @@
           <w:rFonts w:ascii="Roboto Mono" w:hAnsi="Roboto Mono"/>
         </w:rPr>
         <w:pict w14:anchorId="773E9711">
-          <v:rect id="_x0000_i1244" style="width:0;height:1.5pt" o:hralign="center" o:hrstd="t" o:hr="t" fillcolor="#a0a0a0" stroked="f"/>
+          <v:rect id="_x0000_i1045" style="width:0;height:1.5pt" o:hralign="center" o:hrstd="t" o:hr="t" fillcolor="#a0a0a0" stroked="f"/>
         </w:pict>
       </w:r>
     </w:p>
@@ -4231,11 +4751,19 @@
           <w:rFonts w:ascii="Roboto Mono" w:hAnsi="Roboto Mono"/>
         </w:rPr>
       </w:pPr>
-      <w:r>
-        <w:rPr>
-          <w:rFonts w:ascii="Roboto Mono" w:hAnsi="Roboto Mono"/>
-        </w:rPr>
-        <w:t>model.train(data)</w:t>
+      <w:proofErr w:type="spellStart"/>
+      <w:r>
+        <w:rPr>
+          <w:rFonts w:ascii="Roboto Mono" w:hAnsi="Roboto Mono"/>
+        </w:rPr>
+        <w:t>model.train</w:t>
+      </w:r>
+      <w:proofErr w:type="spellEnd"/>
+      <w:r>
+        <w:rPr>
+          <w:rFonts w:ascii="Roboto Mono" w:hAnsi="Roboto Mono"/>
+        </w:rPr>
+        <w:t>(data)</w:t>
       </w:r>
     </w:p>
     <w:p>
@@ -4249,7 +4777,7 @@
           <w:rFonts w:ascii="Roboto Mono" w:hAnsi="Roboto Mono"/>
         </w:rPr>
         <w:pict w14:anchorId="37366428">
-          <v:rect id="_x0000_i1245" style="width:0;height:1.5pt" o:hralign="center" o:hrstd="t" o:hr="t" fillcolor="#a0a0a0" stroked="f"/>
+          <v:rect id="_x0000_i1046" style="width:0;height:1.5pt" o:hralign="center" o:hrstd="t" o:hr="t" fillcolor="#a0a0a0" stroked="f"/>
         </w:pict>
       </w:r>
     </w:p>
@@ -4292,7 +4820,27 @@
           <w:sz w:val="18"/>
           <w:highlight w:val="lightGray"/>
         </w:rPr>
-        <w:t xml:space="preserve">: Persons Table -&gt; ID Column: 1, Name_En Column: Motasem Essam] -&gt; </w:t>
+        <w:t xml:space="preserve">: Persons Table -&gt; ID Column: 1, </w:t>
+      </w:r>
+      <w:proofErr w:type="spellStart"/>
+      <w:r>
+        <w:rPr>
+          <w:rFonts w:ascii="Arial" w:hAnsi="Arial"/>
+          <w:color w:val="000000"/>
+          <w:sz w:val="18"/>
+          <w:highlight w:val="lightGray"/>
+        </w:rPr>
+        <w:t>Name_En</w:t>
+      </w:r>
+      <w:proofErr w:type="spellEnd"/>
+      <w:r>
+        <w:rPr>
+          <w:rFonts w:ascii="Arial" w:hAnsi="Arial"/>
+          <w:color w:val="000000"/>
+          <w:sz w:val="18"/>
+          <w:highlight w:val="lightGray"/>
+        </w:rPr>
+        <w:t xml:space="preserve"> Column: Motasem Essam] -&gt; </w:t>
       </w:r>
       <w:r>
         <w:rPr>
@@ -4348,16 +4896,34 @@
           <w:sz w:val="18"/>
           <w:highlight w:val="lightGray"/>
         </w:rPr>
-        <w:t xml:space="preserve"> [6/</w:t>
-      </w:r>
-      <w:r>
-        <w:rPr>
-          <w:rFonts w:ascii="Arial" w:hAnsi="Arial"/>
-          <w:color w:val="000000"/>
-          <w:sz w:val="18"/>
-          <w:highlight w:val="lightGray"/>
-        </w:rPr>
-        <w:t>7</w:t>
+        <w:t xml:space="preserve"> [</w:t>
+      </w:r>
+      <w:r>
+        <w:rPr>
+          <w:rFonts w:ascii="Arial" w:hAnsi="Arial"/>
+          <w:color w:val="000000"/>
+          <w:sz w:val="18"/>
+          <w:highlight w:val="lightGray"/>
+        </w:rPr>
+        <w:t>1</w:t>
+      </w:r>
+      <w:r>
+        <w:rPr>
+          <w:rFonts w:ascii="Arial" w:hAnsi="Arial"/>
+          <w:color w:val="000000"/>
+          <w:sz w:val="18"/>
+          <w:highlight w:val="lightGray"/>
+        </w:rPr>
+        <w:t>/</w:t>
+      </w:r>
+      <w:r>
+        <w:rPr>
+          <w:rFonts w:ascii="Arial" w:hAnsi="Arial"/>
+          <w:color w:val="000000"/>
+          <w:sz w:val="18"/>
+          <w:highlight w:val="lightGray"/>
+        </w:rPr>
+        <w:t>23</w:t>
       </w:r>
       <w:r>
         <w:rPr>
@@ -4641,7 +5207,7 @@
           <w:rFonts w:ascii="Roboto Mono" w:hAnsi="Roboto Mono"/>
         </w:rPr>
         <w:pict w14:anchorId="3CAD2B79">
-          <v:rect id="_x0000_i1246" style="width:0;height:1.5pt" o:hralign="center" o:hrstd="t" o:hr="t" fillcolor="#a0a0a0" stroked="f"/>
+          <v:rect id="_x0000_i1047" style="width:0;height:1.5pt" o:hralign="center" o:hrstd="t" o:hr="t" fillcolor="#a0a0a0" stroked="f"/>
         </w:pict>
       </w:r>
     </w:p>
@@ -4794,7 +5360,7 @@
           <w:rFonts w:ascii="Roboto Mono" w:hAnsi="Roboto Mono"/>
         </w:rPr>
         <w:pict w14:anchorId="5A698BBC">
-          <v:rect id="_x0000_i1247" style="width:0;height:1.5pt" o:hralign="center" o:hrstd="t" o:hr="t" fillcolor="#a0a0a0" stroked="f"/>
+          <v:rect id="_x0000_i1048" style="width:0;height:1.5pt" o:hralign="center" o:hrstd="t" o:hr="t" fillcolor="#a0a0a0" stroked="f"/>
         </w:pict>
       </w:r>
     </w:p>
@@ -4837,7 +5403,27 @@
           <w:sz w:val="18"/>
           <w:highlight w:val="lightGray"/>
         </w:rPr>
-        <w:t xml:space="preserve">: Persons Table -&gt; ID Column: 1, Name_En Column: Motasem Essam] -&gt; </w:t>
+        <w:t xml:space="preserve">: Persons Table -&gt; ID Column: 1, </w:t>
+      </w:r>
+      <w:proofErr w:type="spellStart"/>
+      <w:r>
+        <w:rPr>
+          <w:rFonts w:ascii="Arial" w:hAnsi="Arial"/>
+          <w:color w:val="000000"/>
+          <w:sz w:val="18"/>
+          <w:highlight w:val="lightGray"/>
+        </w:rPr>
+        <w:t>Name_En</w:t>
+      </w:r>
+      <w:proofErr w:type="spellEnd"/>
+      <w:r>
+        <w:rPr>
+          <w:rFonts w:ascii="Arial" w:hAnsi="Arial"/>
+          <w:color w:val="000000"/>
+          <w:sz w:val="18"/>
+          <w:highlight w:val="lightGray"/>
+        </w:rPr>
+        <w:t xml:space="preserve"> Column: Motasem Essam] -&gt; </w:t>
       </w:r>
       <w:r>
         <w:rPr>
@@ -4893,16 +5479,34 @@
           <w:sz w:val="18"/>
           <w:highlight w:val="lightGray"/>
         </w:rPr>
-        <w:t xml:space="preserve"> [6/</w:t>
-      </w:r>
-      <w:r>
-        <w:rPr>
-          <w:rFonts w:ascii="Arial" w:hAnsi="Arial"/>
-          <w:color w:val="000000"/>
-          <w:sz w:val="18"/>
-          <w:highlight w:val="lightGray"/>
-        </w:rPr>
-        <w:t>7</w:t>
+        <w:t xml:space="preserve"> [</w:t>
+      </w:r>
+      <w:r>
+        <w:rPr>
+          <w:rFonts w:ascii="Arial" w:hAnsi="Arial"/>
+          <w:color w:val="000000"/>
+          <w:sz w:val="18"/>
+          <w:highlight w:val="lightGray"/>
+        </w:rPr>
+        <w:t>1</w:t>
+      </w:r>
+      <w:r>
+        <w:rPr>
+          <w:rFonts w:ascii="Arial" w:hAnsi="Arial"/>
+          <w:color w:val="000000"/>
+          <w:sz w:val="18"/>
+          <w:highlight w:val="lightGray"/>
+        </w:rPr>
+        <w:t>/</w:t>
+      </w:r>
+      <w:r>
+        <w:rPr>
+          <w:rFonts w:ascii="Arial" w:hAnsi="Arial"/>
+          <w:color w:val="000000"/>
+          <w:sz w:val="18"/>
+          <w:highlight w:val="lightGray"/>
+        </w:rPr>
+        <w:t>23</w:t>
       </w:r>
       <w:r>
         <w:rPr>
@@ -5186,7 +5790,7 @@
           <w:rFonts w:ascii="Roboto Mono" w:hAnsi="Roboto Mono"/>
         </w:rPr>
         <w:pict w14:anchorId="1E228FC7">
-          <v:rect id="_x0000_i1248" style="width:0;height:1.5pt" o:hralign="center" o:hrstd="t" o:hr="t" fillcolor="#a0a0a0" stroked="f"/>
+          <v:rect id="_x0000_i1049" style="width:0;height:1.5pt" o:hralign="center" o:hrstd="t" o:hr="t" fillcolor="#a0a0a0" stroked="f"/>
         </w:pict>
       </w:r>
     </w:p>
@@ -5300,7 +5904,7 @@
           <w:rFonts w:ascii="Roboto Mono" w:hAnsi="Roboto Mono"/>
         </w:rPr>
         <w:pict w14:anchorId="2EF28F06">
-          <v:rect id="_x0000_i1249" style="width:0;height:1.5pt" o:hralign="center" o:hrstd="t" o:hr="t" fillcolor="#a0a0a0" stroked="f"/>
+          <v:rect id="_x0000_i1050" style="width:0;height:1.5pt" o:hralign="center" o:hrstd="t" o:hr="t" fillcolor="#a0a0a0" stroked="f"/>
         </w:pict>
       </w:r>
     </w:p>
@@ -5343,7 +5947,27 @@
           <w:sz w:val="18"/>
           <w:highlight w:val="lightGray"/>
         </w:rPr>
-        <w:t xml:space="preserve">: Persons Table -&gt; ID Column: 1, Name_En Column: Motasem Essam] -&gt; </w:t>
+        <w:t xml:space="preserve">: Persons Table -&gt; ID Column: 1, </w:t>
+      </w:r>
+      <w:proofErr w:type="spellStart"/>
+      <w:r>
+        <w:rPr>
+          <w:rFonts w:ascii="Arial" w:hAnsi="Arial"/>
+          <w:color w:val="000000"/>
+          <w:sz w:val="18"/>
+          <w:highlight w:val="lightGray"/>
+        </w:rPr>
+        <w:t>Name_En</w:t>
+      </w:r>
+      <w:proofErr w:type="spellEnd"/>
+      <w:r>
+        <w:rPr>
+          <w:rFonts w:ascii="Arial" w:hAnsi="Arial"/>
+          <w:color w:val="000000"/>
+          <w:sz w:val="18"/>
+          <w:highlight w:val="lightGray"/>
+        </w:rPr>
+        <w:t xml:space="preserve"> Column: Motasem Essam] -&gt; </w:t>
       </w:r>
       <w:r>
         <w:rPr>
@@ -5399,16 +6023,34 @@
           <w:sz w:val="18"/>
           <w:highlight w:val="lightGray"/>
         </w:rPr>
-        <w:t xml:space="preserve"> [6/</w:t>
-      </w:r>
-      <w:r>
-        <w:rPr>
-          <w:rFonts w:ascii="Arial" w:hAnsi="Arial"/>
-          <w:color w:val="000000"/>
-          <w:sz w:val="18"/>
-          <w:highlight w:val="lightGray"/>
-        </w:rPr>
-        <w:t>7</w:t>
+        <w:t xml:space="preserve"> [</w:t>
+      </w:r>
+      <w:r>
+        <w:rPr>
+          <w:rFonts w:ascii="Arial" w:hAnsi="Arial"/>
+          <w:color w:val="000000"/>
+          <w:sz w:val="18"/>
+          <w:highlight w:val="lightGray"/>
+        </w:rPr>
+        <w:t>1</w:t>
+      </w:r>
+      <w:r>
+        <w:rPr>
+          <w:rFonts w:ascii="Arial" w:hAnsi="Arial"/>
+          <w:color w:val="000000"/>
+          <w:sz w:val="18"/>
+          <w:highlight w:val="lightGray"/>
+        </w:rPr>
+        <w:t>/</w:t>
+      </w:r>
+      <w:r>
+        <w:rPr>
+          <w:rFonts w:ascii="Arial" w:hAnsi="Arial"/>
+          <w:color w:val="000000"/>
+          <w:sz w:val="18"/>
+          <w:highlight w:val="lightGray"/>
+        </w:rPr>
+        <w:t>23</w:t>
       </w:r>
       <w:r>
         <w:rPr>
@@ -5873,7 +6515,7 @@
           <w:rFonts w:ascii="Roboto Mono" w:hAnsi="Roboto Mono"/>
         </w:rPr>
         <w:pict w14:anchorId="2A65A8D5">
-          <v:rect id="_x0000_i1250" style="width:0;height:1.5pt" o:hralign="center" o:hrstd="t" o:hr="t" fillcolor="#a0a0a0" stroked="f"/>
+          <v:rect id="_x0000_i1051" style="width:0;height:1.5pt" o:hralign="center" o:hrstd="t" o:hr="t" fillcolor="#a0a0a0" stroked="f"/>
         </w:pict>
       </w:r>
     </w:p>
@@ -5909,7 +6551,27 @@
           <w:sz w:val="18"/>
           <w:highlight w:val="lightGray"/>
         </w:rPr>
-        <w:t xml:space="preserve">: Persons Table -&gt; ID Column: 1, Name_En Column: Motasem Essam] -&gt; </w:t>
+        <w:t xml:space="preserve">: Persons Table -&gt; ID Column: 1, </w:t>
+      </w:r>
+      <w:proofErr w:type="spellStart"/>
+      <w:r>
+        <w:rPr>
+          <w:rFonts w:ascii="Arial" w:hAnsi="Arial"/>
+          <w:color w:val="000000"/>
+          <w:sz w:val="18"/>
+          <w:highlight w:val="lightGray"/>
+        </w:rPr>
+        <w:t>Name_En</w:t>
+      </w:r>
+      <w:proofErr w:type="spellEnd"/>
+      <w:r>
+        <w:rPr>
+          <w:rFonts w:ascii="Arial" w:hAnsi="Arial"/>
+          <w:color w:val="000000"/>
+          <w:sz w:val="18"/>
+          <w:highlight w:val="lightGray"/>
+        </w:rPr>
+        <w:t xml:space="preserve"> Column: Motasem Essam] -&gt; </w:t>
       </w:r>
       <w:r>
         <w:rPr>
@@ -5965,16 +6627,34 @@
           <w:sz w:val="18"/>
           <w:highlight w:val="lightGray"/>
         </w:rPr>
-        <w:t xml:space="preserve"> [6/</w:t>
-      </w:r>
-      <w:r>
-        <w:rPr>
-          <w:rFonts w:ascii="Arial" w:hAnsi="Arial"/>
-          <w:color w:val="000000"/>
-          <w:sz w:val="18"/>
-          <w:highlight w:val="lightGray"/>
-        </w:rPr>
-        <w:t>7</w:t>
+        <w:t xml:space="preserve"> [</w:t>
+      </w:r>
+      <w:r>
+        <w:rPr>
+          <w:rFonts w:ascii="Arial" w:hAnsi="Arial"/>
+          <w:color w:val="000000"/>
+          <w:sz w:val="18"/>
+          <w:highlight w:val="lightGray"/>
+        </w:rPr>
+        <w:t>1</w:t>
+      </w:r>
+      <w:r>
+        <w:rPr>
+          <w:rFonts w:ascii="Arial" w:hAnsi="Arial"/>
+          <w:color w:val="000000"/>
+          <w:sz w:val="18"/>
+          <w:highlight w:val="lightGray"/>
+        </w:rPr>
+        <w:t>/</w:t>
+      </w:r>
+      <w:r>
+        <w:rPr>
+          <w:rFonts w:ascii="Arial" w:hAnsi="Arial"/>
+          <w:color w:val="000000"/>
+          <w:sz w:val="18"/>
+          <w:highlight w:val="lightGray"/>
+        </w:rPr>
+        <w:t>23</w:t>
       </w:r>
       <w:r>
         <w:rPr>
@@ -6112,7 +6792,7 @@
           <w:rFonts w:ascii="Roboto Mono" w:hAnsi="Roboto Mono"/>
         </w:rPr>
         <w:pict w14:anchorId="190AAA14">
-          <v:rect id="_x0000_i1251" style="width:0;height:1.5pt" o:hralign="center" o:hrstd="t" o:hr="t" fillcolor="#a0a0a0" stroked="f"/>
+          <v:rect id="_x0000_i1052" style="width:0;height:1.5pt" o:hralign="center" o:hrstd="t" o:hr="t" fillcolor="#a0a0a0" stroked="f"/>
         </w:pict>
       </w:r>
     </w:p>
@@ -6205,7 +6885,21 @@
         <w:rPr>
           <w:rFonts w:ascii="Roboto Mono" w:hAnsi="Roboto Mono"/>
         </w:rPr>
-        <w:t>$totalPrice = $price * $quantity;</w:t>
+        <w:t>$</w:t>
+      </w:r>
+      <w:proofErr w:type="spellStart"/>
+      <w:r>
+        <w:rPr>
+          <w:rFonts w:ascii="Roboto Mono" w:hAnsi="Roboto Mono"/>
+        </w:rPr>
+        <w:t>totalPrice</w:t>
+      </w:r>
+      <w:proofErr w:type="spellEnd"/>
+      <w:r>
+        <w:rPr>
+          <w:rFonts w:ascii="Roboto Mono" w:hAnsi="Roboto Mono"/>
+        </w:rPr>
+        <w:t xml:space="preserve"> = $price * $quantity;</w:t>
       </w:r>
     </w:p>
     <w:p>
@@ -6219,7 +6913,7 @@
           <w:rFonts w:ascii="Roboto Mono" w:hAnsi="Roboto Mono"/>
         </w:rPr>
         <w:pict w14:anchorId="492B8BAB">
-          <v:rect id="_x0000_i1252" style="width:0;height:1.5pt" o:hralign="center" o:hrstd="t" o:hr="t" fillcolor="#a0a0a0" stroked="f"/>
+          <v:rect id="_x0000_i1053" style="width:0;height:1.5pt" o:hralign="center" o:hrstd="t" o:hr="t" fillcolor="#a0a0a0" stroked="f"/>
         </w:pict>
       </w:r>
     </w:p>
@@ -6339,7 +7033,7 @@
           <w:rFonts w:ascii="Roboto Mono" w:hAnsi="Roboto Mono"/>
         </w:rPr>
         <w:pict w14:anchorId="269A0720">
-          <v:rect id="_x0000_i1253" style="width:0;height:1.5pt" o:hralign="center" o:hrstd="t" o:hr="t" fillcolor="#a0a0a0" stroked="f"/>
+          <v:rect id="_x0000_i1054" style="width:0;height:1.5pt" o:hralign="center" o:hrstd="t" o:hr="t" fillcolor="#a0a0a0" stroked="f"/>
         </w:pict>
       </w:r>
     </w:p>
@@ -6375,7 +7069,27 @@
           <w:sz w:val="18"/>
           <w:highlight w:val="lightGray"/>
         </w:rPr>
-        <w:t xml:space="preserve">: Persons Table -&gt; ID Column: 1, Name_En Column: Motasem Essam] -&gt; </w:t>
+        <w:t xml:space="preserve">: Persons Table -&gt; ID Column: 1, </w:t>
+      </w:r>
+      <w:proofErr w:type="spellStart"/>
+      <w:r>
+        <w:rPr>
+          <w:rFonts w:ascii="Arial" w:hAnsi="Arial"/>
+          <w:color w:val="000000"/>
+          <w:sz w:val="18"/>
+          <w:highlight w:val="lightGray"/>
+        </w:rPr>
+        <w:t>Name_En</w:t>
+      </w:r>
+      <w:proofErr w:type="spellEnd"/>
+      <w:r>
+        <w:rPr>
+          <w:rFonts w:ascii="Arial" w:hAnsi="Arial"/>
+          <w:color w:val="000000"/>
+          <w:sz w:val="18"/>
+          <w:highlight w:val="lightGray"/>
+        </w:rPr>
+        <w:t xml:space="preserve"> Column: Motasem Essam] -&gt; </w:t>
       </w:r>
       <w:r>
         <w:rPr>
@@ -6431,16 +7145,34 @@
           <w:sz w:val="18"/>
           <w:highlight w:val="lightGray"/>
         </w:rPr>
-        <w:t xml:space="preserve"> [6/</w:t>
-      </w:r>
-      <w:r>
-        <w:rPr>
-          <w:rFonts w:ascii="Arial" w:hAnsi="Arial"/>
-          <w:color w:val="000000"/>
-          <w:sz w:val="18"/>
-          <w:highlight w:val="lightGray"/>
-        </w:rPr>
-        <w:t>7</w:t>
+        <w:t xml:space="preserve"> [</w:t>
+      </w:r>
+      <w:r>
+        <w:rPr>
+          <w:rFonts w:ascii="Arial" w:hAnsi="Arial"/>
+          <w:color w:val="000000"/>
+          <w:sz w:val="18"/>
+          <w:highlight w:val="lightGray"/>
+        </w:rPr>
+        <w:t>1</w:t>
+      </w:r>
+      <w:r>
+        <w:rPr>
+          <w:rFonts w:ascii="Arial" w:hAnsi="Arial"/>
+          <w:color w:val="000000"/>
+          <w:sz w:val="18"/>
+          <w:highlight w:val="lightGray"/>
+        </w:rPr>
+        <w:t>/</w:t>
+      </w:r>
+      <w:r>
+        <w:rPr>
+          <w:rFonts w:ascii="Arial" w:hAnsi="Arial"/>
+          <w:color w:val="000000"/>
+          <w:sz w:val="18"/>
+          <w:highlight w:val="lightGray"/>
+        </w:rPr>
+        <w:t>23</w:t>
       </w:r>
       <w:r>
         <w:rPr>
@@ -6584,7 +7316,7 @@
           <w:rFonts w:ascii="Roboto Mono" w:hAnsi="Roboto Mono"/>
         </w:rPr>
         <w:pict w14:anchorId="490CD15B">
-          <v:rect id="_x0000_i1255" style="width:0;height:1.5pt" o:hralign="center" o:hrstd="t" o:hr="t" fillcolor="#a0a0a0" stroked="f"/>
+          <v:rect id="_x0000_i1055" style="width:0;height:1.5pt" o:hralign="center" o:hrstd="t" o:hr="t" fillcolor="#a0a0a0" stroked="f"/>
         </w:pict>
       </w:r>
     </w:p>
@@ -6620,7 +7352,27 @@
           <w:sz w:val="18"/>
           <w:highlight w:val="lightGray"/>
         </w:rPr>
-        <w:t xml:space="preserve">: Persons Table -&gt; ID Column: 1, Name_En Column: Motasem Essam] -&gt; </w:t>
+        <w:t xml:space="preserve">: Persons Table -&gt; ID Column: 1, </w:t>
+      </w:r>
+      <w:proofErr w:type="spellStart"/>
+      <w:r>
+        <w:rPr>
+          <w:rFonts w:ascii="Arial" w:hAnsi="Arial"/>
+          <w:color w:val="000000"/>
+          <w:sz w:val="18"/>
+          <w:highlight w:val="lightGray"/>
+        </w:rPr>
+        <w:t>Name_En</w:t>
+      </w:r>
+      <w:proofErr w:type="spellEnd"/>
+      <w:r>
+        <w:rPr>
+          <w:rFonts w:ascii="Arial" w:hAnsi="Arial"/>
+          <w:color w:val="000000"/>
+          <w:sz w:val="18"/>
+          <w:highlight w:val="lightGray"/>
+        </w:rPr>
+        <w:t xml:space="preserve"> Column: Motasem Essam] -&gt; </w:t>
       </w:r>
       <w:r>
         <w:rPr>
@@ -6676,16 +7428,34 @@
           <w:sz w:val="18"/>
           <w:highlight w:val="lightGray"/>
         </w:rPr>
-        <w:t xml:space="preserve"> [6/</w:t>
-      </w:r>
-      <w:r>
-        <w:rPr>
-          <w:rFonts w:ascii="Arial" w:hAnsi="Arial"/>
-          <w:color w:val="000000"/>
-          <w:sz w:val="18"/>
-          <w:highlight w:val="lightGray"/>
-        </w:rPr>
-        <w:t>7</w:t>
+        <w:t xml:space="preserve"> [</w:t>
+      </w:r>
+      <w:r>
+        <w:rPr>
+          <w:rFonts w:ascii="Arial" w:hAnsi="Arial"/>
+          <w:color w:val="000000"/>
+          <w:sz w:val="18"/>
+          <w:highlight w:val="lightGray"/>
+        </w:rPr>
+        <w:t>1</w:t>
+      </w:r>
+      <w:r>
+        <w:rPr>
+          <w:rFonts w:ascii="Arial" w:hAnsi="Arial"/>
+          <w:color w:val="000000"/>
+          <w:sz w:val="18"/>
+          <w:highlight w:val="lightGray"/>
+        </w:rPr>
+        <w:t>/</w:t>
+      </w:r>
+      <w:r>
+        <w:rPr>
+          <w:rFonts w:ascii="Arial" w:hAnsi="Arial"/>
+          <w:color w:val="000000"/>
+          <w:sz w:val="18"/>
+          <w:highlight w:val="lightGray"/>
+        </w:rPr>
+        <w:t>23</w:t>
       </w:r>
       <w:r>
         <w:rPr>
@@ -7493,6 +8263,7 @@
   <w:style w:type="character" w:default="1" w:styleId="DefaultParagraphFont">
     <w:name w:val="Default Paragraph Font"/>
     <w:uiPriority w:val="1"/>
+    <w:semiHidden/>
     <w:unhideWhenUsed/>
   </w:style>
   <w:style w:type="table" w:default="1" w:styleId="TableNormal">

</xml_diff>